<commit_message>
v1.12.0 Business-Trip & Official-Business Timelines, Leave Rejection States
</commit_message>
<xml_diff>
--- a/frontend/public/templates/businessTripRequest.docx
+++ b/frontend/public/templates/businessTripRequest.docx
@@ -24,7 +24,8 @@
       <w:tblGrid>
         <w:gridCol w:w="1036"/>
         <w:gridCol w:w="2268"/>
-        <w:gridCol w:w="992"/>
+        <w:gridCol w:w="980"/>
+        <w:gridCol w:w="12"/>
         <w:gridCol w:w="2367"/>
         <w:gridCol w:w="140"/>
         <w:gridCol w:w="753"/>
@@ -38,7 +39,7 @@
         <w:tc>
           <w:tcPr>
             <w:tcW w:w="6803" w:type="dxa"/>
-            <w:gridSpan w:val="5"/>
+            <w:gridSpan w:val="6"/>
             <w:tcBorders>
               <w:top w:val="single" w:sz="12" w:space="0" w:color="auto"/>
               <w:bottom w:val="single" w:sz="6" w:space="0" w:color="auto"/>
@@ -69,8 +70,6 @@
               </w:rPr>
               <w:t>單</w:t>
             </w:r>
-            <w:bookmarkStart w:id="0" w:name="_GoBack"/>
-            <w:bookmarkEnd w:id="0"/>
           </w:p>
         </w:tc>
         <w:tc>
@@ -214,6 +213,7 @@
         <w:tc>
           <w:tcPr>
             <w:tcW w:w="992" w:type="dxa"/>
+            <w:gridSpan w:val="2"/>
             <w:tcBorders>
               <w:top w:val="nil"/>
             </w:tcBorders>
@@ -348,22 +348,7 @@
               <w:rPr>
                 <w:rFonts w:ascii="標楷體" w:eastAsia="標楷體" w:hAnsi="標楷體" w:hint="eastAsia"/>
               </w:rPr>
-              <w:t>洽辦</w:t>
-            </w:r>
-          </w:p>
-          <w:p>
-            <w:pPr>
-              <w:ind w:left="57" w:right="57"/>
-              <w:jc w:val="distribute"/>
-              <w:rPr>
-                <w:rFonts w:ascii="標楷體" w:eastAsia="標楷體" w:hAnsi="標楷體"/>
-              </w:rPr>
-            </w:pPr>
-            <w:r>
-              <w:rPr>
-                <w:rFonts w:ascii="標楷體" w:eastAsia="標楷體" w:hAnsi="標楷體" w:hint="eastAsia"/>
-              </w:rPr>
-              <w:t>對象</w:t>
+              <w:t>目的地</w:t>
             </w:r>
           </w:p>
         </w:tc>
@@ -408,6 +393,7 @@
         <w:tc>
           <w:tcPr>
             <w:tcW w:w="992" w:type="dxa"/>
+            <w:gridSpan w:val="2"/>
             <w:tcBorders>
               <w:bottom w:val="nil"/>
             </w:tcBorders>
@@ -512,14 +498,25 @@
               <w:rPr>
                 <w:rFonts w:ascii="標楷體" w:eastAsia="標楷體" w:hAnsi="標楷體" w:hint="eastAsia"/>
               </w:rPr>
-              <w:t>事由</w:t>
-            </w:r>
-          </w:p>
-        </w:tc>
-        <w:tc>
-          <w:tcPr>
-            <w:tcW w:w="8887" w:type="dxa"/>
-            <w:gridSpan w:val="6"/>
+              <w:t>洽辦</w:t>
+            </w:r>
+            <w:r>
+              <w:rPr>
+                <w:rFonts w:ascii="標楷體" w:eastAsia="標楷體" w:hAnsi="標楷體"/>
+              </w:rPr>
+              <w:br/>
+            </w:r>
+            <w:r>
+              <w:rPr>
+                <w:rFonts w:ascii="標楷體" w:eastAsia="標楷體" w:hAnsi="標楷體" w:hint="eastAsia"/>
+              </w:rPr>
+              <w:t>對象</w:t>
+            </w:r>
+          </w:p>
+        </w:tc>
+        <w:tc>
+          <w:tcPr>
+            <w:tcW w:w="2268" w:type="dxa"/>
             <w:vAlign w:val="center"/>
           </w:tcPr>
           <w:p>
@@ -537,15 +534,59 @@
             </w:r>
             <w:r>
               <w:rPr>
-                <w:rFonts w:ascii="標楷體" w:eastAsia="標楷體" w:hAnsi="標楷體"/>
-              </w:rPr>
-              <w:t>purpose</w:t>
-            </w:r>
-            <w:r>
-              <w:rPr>
-                <w:rFonts w:ascii="標楷體" w:eastAsia="標楷體" w:hAnsi="標楷體"/>
-              </w:rPr>
-              <w:t>}</w:t>
+                <w:rFonts w:ascii="標楷體" w:eastAsia="標楷體" w:hAnsi="標楷體" w:hint="eastAsia"/>
+              </w:rPr>
+              <w:t>c</w:t>
+            </w:r>
+            <w:r>
+              <w:rPr>
+                <w:rFonts w:ascii="標楷體" w:eastAsia="標楷體" w:hAnsi="標楷體"/>
+              </w:rPr>
+              <w:t>ontactPerson}</w:t>
+            </w:r>
+            <w:bookmarkStart w:id="0" w:name="_GoBack"/>
+            <w:bookmarkEnd w:id="0"/>
+          </w:p>
+        </w:tc>
+        <w:tc>
+          <w:tcPr>
+            <w:tcW w:w="980" w:type="dxa"/>
+            <w:vAlign w:val="center"/>
+          </w:tcPr>
+          <w:p>
+            <w:pPr>
+              <w:ind w:left="57" w:right="57"/>
+              <w:jc w:val="distribute"/>
+              <w:rPr>
+                <w:rFonts w:ascii="標楷體" w:eastAsia="標楷體" w:hAnsi="標楷體"/>
+              </w:rPr>
+            </w:pPr>
+            <w:r>
+              <w:rPr>
+                <w:rFonts w:ascii="標楷體" w:eastAsia="標楷體" w:hAnsi="標楷體" w:hint="eastAsia"/>
+              </w:rPr>
+              <w:t>目的</w:t>
+            </w:r>
+          </w:p>
+        </w:tc>
+        <w:tc>
+          <w:tcPr>
+            <w:tcW w:w="5639" w:type="dxa"/>
+            <w:gridSpan w:val="5"/>
+            <w:vAlign w:val="center"/>
+          </w:tcPr>
+          <w:p>
+            <w:pPr>
+              <w:jc w:val="center"/>
+              <w:rPr>
+                <w:rFonts w:ascii="標楷體" w:eastAsia="標楷體" w:hAnsi="標楷體"/>
+              </w:rPr>
+            </w:pPr>
+            <w:r>
+              <w:rPr>
+                <w:rFonts w:ascii="標楷體" w:eastAsia="標楷體" w:hAnsi="標楷體"/>
+              </w:rPr>
+              <w:t>{purpose}</w:t>
             </w:r>
           </w:p>
         </w:tc>
@@ -623,6 +664,7 @@
         <w:tc>
           <w:tcPr>
             <w:tcW w:w="992" w:type="dxa"/>
+            <w:gridSpan w:val="2"/>
             <w:vAlign w:val="center"/>
           </w:tcPr>
           <w:p>

</xml_diff>

<commit_message>
v1.14.1 Business-Trip Clock-Times Excel Export
</commit_message>
<xml_diff>
--- a/frontend/public/templates/businessTripRequest.docx
+++ b/frontend/public/templates/businessTripRequest.docx
@@ -409,10 +409,12 @@
             </w:pPr>
             <w:r>
               <w:rPr>
-                <w:rFonts w:ascii="標楷體" w:eastAsia="標楷體" w:hAnsi="標楷體" w:hint="eastAsia"/>
-              </w:rPr>
-              <w:t>出差</w:t>
-            </w:r>
+                <w:rFonts w:ascii="標楷體" w:eastAsia="標楷體" w:hAnsi="標楷體"/>
+              </w:rPr>
+              <w:t>起訖</w:t>
+            </w:r>
+            <w:bookmarkStart w:id="0" w:name="_GoBack"/>
+            <w:bookmarkEnd w:id="0"/>
             <w:r>
               <w:rPr>
                 <w:rFonts w:ascii="標楷體" w:eastAsia="標楷體" w:hAnsi="標楷體"/>
@@ -544,8 +546,6 @@
               </w:rPr>
               <w:t>ontactPerson}</w:t>
             </w:r>
-            <w:bookmarkStart w:id="0" w:name="_GoBack"/>
-            <w:bookmarkEnd w:id="0"/>
           </w:p>
         </w:tc>
         <w:tc>

</xml_diff>